<commit_message>
update cv and resume
</commit_message>
<xml_diff>
--- a/assets/cv/cv.docx
+++ b/assets/cv/cv.docx
@@ -1579,76 +1579,7 @@
             <w:color w:val="003380"/>
             <w:sz w:val="20"/>
           </w:rPr>
-          <w:t>Bminor Compiler</w:t>
-        </w:r>
-      </w:hyperlink>
-      <w:r>
-        <w:rPr>
-          <w:sz w:val="20"/>
-        </w:rPr>
-        <w:t xml:space="preserve"> | </w:t>
-      </w:r>
-      <w:r>
-        <w:rPr>
-          <w:i/>
-          <w:sz w:val="20"/>
-        </w:rPr>
-        <w:t>C, Rust, x86 Assembly</w:t>
-      </w:r>
-      <w:r>
-        <w:tab/>
-      </w:r>
-      <w:r>
-        <w:rPr>
-          <w:i/>
-          <w:sz w:val="20"/>
-        </w:rPr>
-        <w:t>Oct 2025 – Present</w:t>
-      </w:r>
-    </w:p>
-    <w:p>
-      <w:pPr>
-        <w:pStyle w:val="ListBullet"/>
-        <w:spacing w:before="20" w:after="0"/>
-        <w:ind w:left="576" w:hanging="259"/>
-      </w:pPr>
-      <w:r>
-        <w:rPr>
-          <w:sz w:val="19"/>
-        </w:rPr>
-        <w:t>Ported a multi-stage C compiler to idiomatic Rust, implementing lexing, AST parsing, static type checking, and x86-64 code generation.</w:t>
-      </w:r>
-    </w:p>
-    <w:p>
-      <w:pPr>
-        <w:pStyle w:val="ListBullet"/>
-        <w:spacing w:before="30" w:after="0"/>
-        <w:ind w:left="576" w:hanging="259"/>
-      </w:pPr>
-      <w:r>
-        <w:rPr>
-          <w:sz w:val="19"/>
-        </w:rPr>
-        <w:t>Refactored C’s legacy pointer-heavy data structures into memory-safe pattern matching and algebraic types.</w:t>
-      </w:r>
-    </w:p>
-    <w:p>
-      <w:pPr>
-        <w:keepNext/>
-        <w:tabs>
-          <w:tab w:pos="10800" w:val="right"/>
-        </w:tabs>
-        <w:spacing w:before="100" w:after="0"/>
-        <w:ind w:left="0" w:firstLine="0"/>
-      </w:pPr>
-      <w:hyperlink r:id="rId19">
-        <w:r>
-          <w:rPr>
-            <w:b/>
-            <w:color w:val="003380"/>
-            <w:sz w:val="20"/>
-          </w:rPr>
-          <w:t>High-Performance Distributed Systems (CSE 60772)</w:t>
+          <w:t>High-Performance Distributed Systems</w:t>
         </w:r>
       </w:hyperlink>
       <w:r>
@@ -1725,6 +1656,75 @@
           <w:sz w:val="19"/>
         </w:rPr>
         <w:t xml:space="preserve"> gave ~7× over unoptimized code; SIMD ISA flags had negligible effect) and OpenMP N-body scaling across sockets.</w:t>
+      </w:r>
+    </w:p>
+    <w:p>
+      <w:pPr>
+        <w:keepNext/>
+        <w:tabs>
+          <w:tab w:pos="10800" w:val="right"/>
+        </w:tabs>
+        <w:spacing w:before="100" w:after="0"/>
+        <w:ind w:left="0" w:firstLine="0"/>
+      </w:pPr>
+      <w:hyperlink r:id="rId19">
+        <w:r>
+          <w:rPr>
+            <w:b/>
+            <w:color w:val="003380"/>
+            <w:sz w:val="20"/>
+          </w:rPr>
+          <w:t>Bminor Compiler</w:t>
+        </w:r>
+      </w:hyperlink>
+      <w:r>
+        <w:rPr>
+          <w:sz w:val="20"/>
+        </w:rPr>
+        <w:t xml:space="preserve"> | </w:t>
+      </w:r>
+      <w:r>
+        <w:rPr>
+          <w:i/>
+          <w:sz w:val="20"/>
+        </w:rPr>
+        <w:t>C, Rust, x86 Assembly</w:t>
+      </w:r>
+      <w:r>
+        <w:tab/>
+      </w:r>
+      <w:r>
+        <w:rPr>
+          <w:i/>
+          <w:sz w:val="20"/>
+        </w:rPr>
+        <w:t>Oct 2025 – Present</w:t>
+      </w:r>
+    </w:p>
+    <w:p>
+      <w:pPr>
+        <w:pStyle w:val="ListBullet"/>
+        <w:spacing w:before="20" w:after="0"/>
+        <w:ind w:left="576" w:hanging="259"/>
+      </w:pPr>
+      <w:r>
+        <w:rPr>
+          <w:sz w:val="19"/>
+        </w:rPr>
+        <w:t>Ported a multi-stage C compiler to idiomatic Rust, implementing lexing, AST parsing, static type checking, and x86-64 code generation.</w:t>
+      </w:r>
+    </w:p>
+    <w:p>
+      <w:pPr>
+        <w:pStyle w:val="ListBullet"/>
+        <w:spacing w:before="30" w:after="0"/>
+        <w:ind w:left="576" w:hanging="259"/>
+      </w:pPr>
+      <w:r>
+        <w:rPr>
+          <w:sz w:val="19"/>
+        </w:rPr>
+        <w:t>Refactored C’s legacy pointer-heavy data structures into memory-safe pattern matching and algebraic types.</w:t>
       </w:r>
     </w:p>
     <w:p>

</xml_diff>

<commit_message>
add new paper to resume and CV
</commit_message>
<xml_diff>
--- a/assets/cv/cv.docx
+++ b/assets/cv/cv.docx
@@ -359,6 +359,57 @@
         <w:rPr>
           <w:sz w:val="19"/>
         </w:rPr>
+        <w:t xml:space="preserve">Liubov Kurafeeva, </w:t>
+      </w:r>
+      <w:r>
+        <w:rPr>
+          <w:b/>
+          <w:sz w:val="19"/>
+        </w:rPr>
+        <w:t>Ryan Hartung</w:t>
+      </w:r>
+      <w:r>
+        <w:rPr>
+          <w:sz w:val="19"/>
+        </w:rPr>
+        <w:t xml:space="preserve">, Benjamin Carter, Alan Subedi, Avhishek Biswas, Michael Fay, Shantenu Jha, Chandra Krintz, Andre Merzky, Douglas Thain, Mehmet Vuran, and Rich Wolski. “Asynchronous Scientific Workflows for Simulation-Driven Inference Across the Edge–HPC Computing Continuum.” </w:t>
+      </w:r>
+      <w:r>
+        <w:rPr>
+          <w:i/>
+          <w:sz w:val="19"/>
+        </w:rPr>
+        <w:t>Future Generation Computer Systems</w:t>
+      </w:r>
+      <w:r>
+        <w:rPr>
+          <w:sz w:val="19"/>
+        </w:rPr>
+        <w:t xml:space="preserve"> (Elsevier), special issue, 2026. (Under review).</w:t>
+      </w:r>
+    </w:p>
+    <w:p>
+      <w:pPr>
+        <w:keepNext w:val="0"/>
+        <w:tabs>
+          <w:tab w:pos="864" w:val="left"/>
+        </w:tabs>
+        <w:spacing w:before="40" w:after="0"/>
+        <w:ind w:left="864" w:hanging="864"/>
+      </w:pPr>
+      <w:r>
+        <w:rPr>
+          <w:sz w:val="19"/>
+        </w:rPr>
+        <w:t>[2026]</w:t>
+      </w:r>
+      <w:r>
+        <w:tab/>
+      </w:r>
+      <w:r>
+        <w:rPr>
+          <w:sz w:val="19"/>
+        </w:rPr>
         <w:t xml:space="preserve">Liubov Kurafeeva, Benjamin Carter, </w:t>
       </w:r>
       <w:r>
@@ -379,13 +430,13 @@
           <w:i/>
           <w:sz w:val="19"/>
         </w:rPr>
-        <w:t>Proceedings of IEEE SCTech 2026</w:t>
+        <w:t>Proceedings of IEEE Smart Connected Systems and Emerging Technologies Conference (IEEE SCSETech)</w:t>
       </w:r>
       <w:r>
         <w:rPr>
           <w:sz w:val="19"/>
         </w:rPr>
-        <w:t xml:space="preserve"> (To appear).</w:t>
+        <w:t>, 2026 (To appear).</w:t>
       </w:r>
     </w:p>
     <w:p>

</xml_diff>

<commit_message>
update resume and CV
</commit_message>
<xml_diff>
--- a/assets/cv/cv.docx
+++ b/assets/cv/cv.docx
@@ -385,7 +385,7 @@
         <w:rPr>
           <w:sz w:val="19"/>
         </w:rPr>
-        <w:t xml:space="preserve"> (Elsevier), special issue, 2026. (Under review).</w:t>
+        <w:t xml:space="preserve"> (Elsevier), special issue. (Under review).</w:t>
       </w:r>
     </w:p>
     <w:p>
@@ -1599,6 +1599,26 @@
     </w:p>
     <w:p>
       <w:pPr>
+        <w:keepNext w:val="0"/>
+        <w:spacing w:before="0" w:after="0"/>
+        <w:ind w:left="0" w:firstLine="0"/>
+      </w:pPr>
+      <w:r>
+        <w:rPr>
+          <w:b/>
+          <w:sz w:val="19"/>
+        </w:rPr>
+        <w:t>Languages:</w:t>
+      </w:r>
+      <w:r>
+        <w:rPr>
+          <w:sz w:val="19"/>
+        </w:rPr>
+        <w:t xml:space="preserve"> English (native), Spanish (intermediate; stronger reading)</w:t>
+      </w:r>
+    </w:p>
+    <w:p>
+      <w:pPr>
         <w:keepNext/>
         <w:spacing w:before="180" w:after="60"/>
         <w:ind w:left="0" w:firstLine="0"/>
@@ -1996,6 +2016,23 @@
         </w:tc>
       </w:tr>
     </w:tbl>
+    <w:p>
+      <w:pPr>
+        <w:keepNext/>
+        <w:spacing w:before="180" w:after="60"/>
+        <w:ind w:left="0" w:firstLine="0"/>
+        <w:pBdr>
+          <w:bottom w:val="single" w:sz="6" w:space="1" w:color="000000"/>
+        </w:pBdr>
+      </w:pPr>
+      <w:r>
+        <w:rPr>
+          <w:smallCaps/>
+          <w:sz w:val="24"/>
+        </w:rPr>
+        <w:t>Memberships, Clubs, &amp; Interests</w:t>
+      </w:r>
+    </w:p>
     <w:tbl>
       <w:tblPr>
         <w:tblW w:type="auto" w:w="0"/>
@@ -2231,6 +2268,72 @@
                 <w:b/>
                 <w:sz w:val="19"/>
               </w:rPr>
+              <w:t>Association for Computing Machinery (ACM)</w:t>
+            </w:r>
+            <w:r>
+              <w:rPr>
+                <w:sz w:val="19"/>
+              </w:rPr>
+              <w:t>, Student Member</w:t>
+            </w:r>
+          </w:p>
+        </w:tc>
+        <w:tc>
+          <w:tcPr>
+            <w:tcW w:type="dxa" w:w="2520"/>
+          </w:tcPr>
+          <w:p>
+            <w:pPr>
+              <w:spacing w:after="40"/>
+              <w:jc w:val="right"/>
+            </w:pPr>
+            <w:r>
+              <w:rPr>
+                <w:sz w:val="19"/>
+              </w:rPr>
+              <w:t>May 2025 – Present</w:t>
+            </w:r>
+          </w:p>
+        </w:tc>
+      </w:tr>
+    </w:tbl>
+    <w:tbl>
+      <w:tblPr>
+        <w:tblW w:type="auto" w:w="0"/>
+        <w:jc w:val="left"/>
+        <w:tblLayout w:type="fixed"/>
+        <w:tblLook w:firstColumn="1" w:firstRow="1" w:lastColumn="0" w:lastRow="0" w:noHBand="0" w:noVBand="1" w:val="04A0"/>
+        <w:tblBorders>
+          <w:top w:val="nil"/>
+          <w:left w:val="nil"/>
+          <w:bottom w:val="nil"/>
+          <w:right w:val="nil"/>
+          <w:insideH w:val="nil"/>
+          <w:insideV w:val="nil"/>
+        </w:tblBorders>
+        <w:tblCellMar>
+          <w:left w:w="0" w:type="dxa"/>
+          <w:right w:w="0" w:type="dxa"/>
+        </w:tblCellMar>
+      </w:tblPr>
+      <w:tblGrid>
+        <w:gridCol w:w="8280"/>
+        <w:gridCol w:w="2520"/>
+      </w:tblGrid>
+      <w:tr>
+        <w:tc>
+          <w:tcPr>
+            <w:tcW w:type="dxa" w:w="8280"/>
+          </w:tcPr>
+          <w:p>
+            <w:pPr>
+              <w:spacing w:after="40"/>
+            </w:pPr>
+            <w:r>
+              <w:rPr>
+                <w:b/>
+                <w:sz w:val="19"/>
+              </w:rPr>
               <w:t>Catholic Graduate Community</w:t>
             </w:r>
             <w:r>
@@ -2520,6 +2623,66 @@
               </w:rPr>
               <w:t>August 2011 – Present</w:t>
             </w:r>
+          </w:p>
+        </w:tc>
+      </w:tr>
+    </w:tbl>
+    <w:tbl>
+      <w:tblPr>
+        <w:tblW w:type="auto" w:w="0"/>
+        <w:jc w:val="left"/>
+        <w:tblLayout w:type="fixed"/>
+        <w:tblLook w:firstColumn="1" w:firstRow="1" w:lastColumn="0" w:lastRow="0" w:noHBand="0" w:noVBand="1" w:val="04A0"/>
+        <w:tblBorders>
+          <w:top w:val="nil"/>
+          <w:left w:val="nil"/>
+          <w:bottom w:val="nil"/>
+          <w:right w:val="nil"/>
+          <w:insideH w:val="nil"/>
+          <w:insideV w:val="nil"/>
+        </w:tblBorders>
+        <w:tblCellMar>
+          <w:left w:w="0" w:type="dxa"/>
+          <w:right w:w="0" w:type="dxa"/>
+        </w:tblCellMar>
+      </w:tblPr>
+      <w:tblGrid>
+        <w:gridCol w:w="8280"/>
+        <w:gridCol w:w="2520"/>
+      </w:tblGrid>
+      <w:tr>
+        <w:tc>
+          <w:tcPr>
+            <w:tcW w:type="dxa" w:w="8280"/>
+          </w:tcPr>
+          <w:p>
+            <w:pPr>
+              <w:spacing w:after="40"/>
+            </w:pPr>
+            <w:r>
+              <w:rPr>
+                <w:b/>
+                <w:sz w:val="19"/>
+              </w:rPr>
+              <w:t>Interests:</w:t>
+            </w:r>
+            <w:r>
+              <w:rPr>
+                <w:sz w:val="19"/>
+              </w:rPr>
+              <w:t xml:space="preserve"> Language learning/linguistics, volleyball, intramural soccer, road trips, anime/manga</w:t>
+            </w:r>
+          </w:p>
+        </w:tc>
+        <w:tc>
+          <w:tcPr>
+            <w:tcW w:type="dxa" w:w="2520"/>
+          </w:tcPr>
+          <w:p>
+            <w:pPr>
+              <w:spacing w:after="40"/>
+              <w:jc w:val="right"/>
+            </w:pPr>
           </w:p>
         </w:tc>
       </w:tr>

</xml_diff>